<commit_message>
docs(report): update academic metadata, course code CSA0921, and relative paths in DOCX and PDF
</commit_message>
<xml_diff>
--- a/report/SIMATS_Java_Assignment_1_Report.docx
+++ b/report/SIMATS_Java_Assignment_1_Report.docx
@@ -31,7 +31,7 @@
           <w:color w:val="1A365D"/>
           <w:sz w:val="44"/>
         </w:rPr>
-        <w:t>Programming in Java (CO1)</w:t>
+        <w:t>Java Programming (CSA0921)</w:t>
         <w:br/>
         <w:t>ASSIGNMENT 1 REPORT</w:t>
       </w:r>
@@ -105,7 +105,7 @@
                 <w:color w:val="2D3748"/>
                 <w:sz w:val="19"/>
               </w:rPr>
-              <w:t>Student Name</w:t>
+              <w:t>Assignment Title</w:t>
             </w:r>
           </w:p>
         </w:tc>
@@ -129,7 +129,7 @@
                 <w:color w:val="1A202C"/>
                 <w:sz w:val="19"/>
               </w:rPr>
-              <w:t>Bala Naga Jaswanth</w:t>
+              <w:t>Design, Implement and Validate an Object-Oriented Model for a Campus Smart-Parking System</w:t>
             </w:r>
           </w:p>
         </w:tc>
@@ -156,7 +156,7 @@
                 <w:color w:val="2D3748"/>
                 <w:sz w:val="19"/>
               </w:rPr>
-              <w:t>Registration Number</w:t>
+              <w:t>Course / Subject</w:t>
             </w:r>
           </w:p>
         </w:tc>
@@ -177,11 +177,10 @@
             </w:pPr>
             <w:r>
               <w:rPr>
-                <w:b/>
                 <w:color w:val="1A202C"/>
                 <w:sz w:val="19"/>
               </w:rPr>
-              <w:t>192424300</w:t>
+              <w:t>Java Programming</w:t>
             </w:r>
           </w:p>
         </w:tc>
@@ -208,7 +207,7 @@
                 <w:color w:val="2D3748"/>
                 <w:sz w:val="19"/>
               </w:rPr>
-              <w:t>Course Outcome</w:t>
+              <w:t>Course Code</w:t>
             </w:r>
           </w:p>
         </w:tc>
@@ -232,7 +231,7 @@
                 <w:color w:val="1A202C"/>
                 <w:sz w:val="19"/>
               </w:rPr>
-              <w:t>CO1: Java Fundamentals &amp; Object-Oriented Programming</w:t>
+              <w:t>CSA0921</w:t>
             </w:r>
           </w:p>
         </w:tc>
@@ -259,7 +258,7 @@
                 <w:color w:val="2D3748"/>
                 <w:sz w:val="19"/>
               </w:rPr>
-              <w:t>Mandatory Repository</w:t>
+              <w:t>Student Name</w:t>
             </w:r>
           </w:p>
         </w:tc>
@@ -283,7 +282,7 @@
                 <w:color w:val="1A202C"/>
                 <w:sz w:val="19"/>
               </w:rPr>
-              <w:t>CSA09-192424300-Assignment1</w:t>
+              <w:t>Bala Naga Jaswanth</w:t>
             </w:r>
           </w:p>
         </w:tc>
@@ -310,7 +309,7 @@
                 <w:color w:val="2D3748"/>
                 <w:sz w:val="19"/>
               </w:rPr>
-              <w:t>GitHub Repository Link</w:t>
+              <w:t>Registration Number</w:t>
             </w:r>
           </w:p>
         </w:tc>
@@ -331,10 +330,11 @@
             </w:pPr>
             <w:r>
               <w:rPr>
+                <w:b/>
                 <w:color w:val="1A202C"/>
                 <w:sz w:val="19"/>
               </w:rPr>
-              <w:t>https://github.com/Jaswanth300/CSA09-192424300-Assignment1</w:t>
+              <w:t>192424300</w:t>
             </w:r>
           </w:p>
         </w:tc>
@@ -361,7 +361,7 @@
                 <w:color w:val="2D3748"/>
                 <w:sz w:val="19"/>
               </w:rPr>
-              <w:t>Target Java Version</w:t>
+              <w:t>GitHub Repository Link</w:t>
             </w:r>
           </w:p>
         </w:tc>
@@ -385,58 +385,7 @@
                 <w:color w:val="1A202C"/>
                 <w:sz w:val="19"/>
               </w:rPr>
-              <w:t>OpenJDK 21 LTS (javac 21.0.12.1 verified)</w:t>
-            </w:r>
-          </w:p>
-        </w:tc>
-      </w:tr>
-      <w:tr>
-        <w:tc>
-          <w:tcPr>
-            <w:tcW w:type="dxa" w:w="3600"/>
-            <w:shd w:fill="F7FAFC"/>
-            <w:tcMar>
-              <w:top w:w="80" w:type="dxa"/>
-              <w:bottom w:w="80" w:type="dxa"/>
-              <w:left w:w="120" w:type="dxa"/>
-              <w:right w:w="120" w:type="dxa"/>
-            </w:tcMar>
-          </w:tcPr>
-          <w:p>
-            <w:pPr>
-              <w:spacing w:after="0"/>
-            </w:pPr>
-            <w:r>
-              <w:rPr>
-                <w:b/>
-                <w:color w:val="2D3748"/>
-                <w:sz w:val="19"/>
-              </w:rPr>
-              <w:t>Execution Platform</w:t>
-            </w:r>
-          </w:p>
-        </w:tc>
-        <w:tc>
-          <w:tcPr>
-            <w:tcW w:type="dxa" w:w="6048"/>
-            <w:shd w:fill="FFFFFF"/>
-            <w:tcMar>
-              <w:top w:w="80" w:type="dxa"/>
-              <w:bottom w:w="80" w:type="dxa"/>
-              <w:left w:w="120" w:type="dxa"/>
-              <w:right w:w="120" w:type="dxa"/>
-            </w:tcMar>
-          </w:tcPr>
-          <w:p>
-            <w:pPr>
-              <w:spacing w:after="0"/>
-            </w:pPr>
-            <w:r>
-              <w:rPr>
-                <w:color w:val="1A202C"/>
-                <w:sz w:val="19"/>
-              </w:rPr>
-              <w:t>Windows 11 / Windows PowerShell 5.1</w:t>
+              <w:t>https://github.com/Jaswanth300/CSA09-192424300-Assignment1</w:t>
             </w:r>
           </w:p>
         </w:tc>
@@ -457,9 +406,9 @@
         <w:br/>
         <w:t>Tasks 1–11: 42 Marks | Task 12 (Day-4 Design Challenge): 8 Marks</w:t>
         <w:br/>
-        <w:t>• Java Implementation &amp; Execution: 100% Completed &amp; Verified (Exit 0)</w:t>
+        <w:t>• All 12 Tasks Verified (Exit Code 0)</w:t>
         <w:br/>
-        <w:t>• Evidence Status: All 12 Tasks Verified (Exit 0) | Genuine Eclipse IDE Screenshots Embedded</w:t>
+        <w:t>• Genuine Eclipse IDE Screenshots &amp; Execution Evidence Embedded</w:t>
       </w:r>
     </w:p>
     <w:p>
@@ -2243,7 +2192,7 @@
                 <w:rFonts w:ascii="Calibri" w:hAnsi="Calibri"/>
                 <w:sz w:val="17"/>
               </w:rPr>
-              <w:t>Consolidated 50-Mark Academic Submission</w:t>
+              <w:t>Consolidated Assignment Total</w:t>
             </w:r>
           </w:p>
         </w:tc>
@@ -2318,7 +2267,7 @@
                 <w:rFonts w:ascii="Calibri" w:hAnsi="Calibri"/>
                 <w:sz w:val="17"/>
               </w:rPr>
-              <w:t>100% Completed</w:t>
+              <w:t>Completed &amp; Verified</w:t>
             </w:r>
           </w:p>
         </w:tc>
@@ -2421,7 +2370,7 @@
     </w:p>
     <w:p>
       <w:r>
-        <w:t>Marks: 4 Marks | Bloom's Level: K4 - Analyse | Workspace: Task01/</w:t>
+        <w:t>Marks: 4 Marks | Bloom's Level: K4 - Analyse | Workspace: TASKS/Task01/</w:t>
       </w:r>
     </w:p>
     <w:p>
@@ -4075,7 +4024,7 @@
     </w:p>
     <w:p>
       <w:r>
-        <w:t>Marks: 3 Marks | Bloom's Level: K4 - Analyse | Workspace: Task02/</w:t>
+        <w:t>Marks: 3 Marks | Bloom's Level: K4 - Analyse | Workspace: TASKS/Task02/</w:t>
       </w:r>
     </w:p>
     <w:p>
@@ -5741,7 +5690,7 @@
     </w:p>
     <w:p>
       <w:r>
-        <w:t>Marks: 4 Marks | Bloom's Level: K4 - Analyse | Workspace: Task03/</w:t>
+        <w:t>Marks: 4 Marks | Bloom's Level: K4 - Analyse | Workspace: TASKS/Task03/</w:t>
       </w:r>
     </w:p>
     <w:p>
@@ -7404,7 +7353,7 @@
               <a:graphicData uri="http://schemas.openxmlformats.org/drawingml/2006/picture">
                 <pic:pic>
                   <pic:nvPicPr>
-                    <pic:cNvPr id="0" name="screenshot_Task-03.png"/>
+                    <pic:cNvPr id="0" name="screenshot_Task03.png"/>
                     <pic:cNvPicPr/>
                   </pic:nvPicPr>
                   <pic:blipFill>
@@ -7486,7 +7435,7 @@
     </w:p>
     <w:p>
       <w:r>
-        <w:t>Marks: 4 Marks | Bloom's Level: K4 - Analyse | Workspace: Task04/</w:t>
+        <w:t>Marks: 4 Marks | Bloom's Level: K4 - Analyse | Workspace: TASKS/Task04/</w:t>
       </w:r>
     </w:p>
     <w:p>
@@ -7893,7 +7842,7 @@
               <a:graphicData uri="http://schemas.openxmlformats.org/drawingml/2006/picture">
                 <pic:pic>
                   <pic:nvPicPr>
-                    <pic:cNvPr id="0" name="screenshot_Task-04.png"/>
+                    <pic:cNvPr id="0" name="screenshot_Task04.png"/>
                     <pic:cNvPicPr/>
                   </pic:nvPicPr>
                   <pic:blipFill>
@@ -8413,7 +8362,7 @@
     </w:p>
     <w:p>
       <w:r>
-        <w:t>Marks: 3 Marks | Bloom's Level: K4 - Analyse | Workspace: Task05/</w:t>
+        <w:t>Marks: 3 Marks | Bloom's Level: K4 - Analyse | Workspace: TASKS/Task05/</w:t>
       </w:r>
     </w:p>
     <w:p>
@@ -8632,7 +8581,7 @@
               <a:graphicData uri="http://schemas.openxmlformats.org/drawingml/2006/picture">
                 <pic:pic>
                   <pic:nvPicPr>
-                    <pic:cNvPr id="0" name="screenshot_Task-05.png"/>
+                    <pic:cNvPr id="0" name="screenshot_Task05.png"/>
                     <pic:cNvPicPr/>
                   </pic:nvPicPr>
                   <pic:blipFill>
@@ -8716,7 +8665,7 @@
     </w:p>
     <w:p>
       <w:r>
-        <w:t>Marks: 4 Marks | Bloom's Level: K4 - Analyse | Workspace: Task06/</w:t>
+        <w:t>Marks: 4 Marks | Bloom's Level: K4 - Analyse | Workspace: TASKS/Task06/</w:t>
       </w:r>
     </w:p>
     <w:p>
@@ -9020,7 +8969,7 @@
               <a:graphicData uri="http://schemas.openxmlformats.org/drawingml/2006/picture">
                 <pic:pic>
                   <pic:nvPicPr>
-                    <pic:cNvPr id="0" name="screenshot_Task-06.png"/>
+                    <pic:cNvPr id="0" name="screenshot_Task06.png"/>
                     <pic:cNvPicPr/>
                   </pic:nvPicPr>
                   <pic:blipFill>
@@ -9102,7 +9051,7 @@
     </w:p>
     <w:p>
       <w:r>
-        <w:t>Marks: 4 Marks | Bloom's Level: K4 - Analyse | Workspace: Task07/</w:t>
+        <w:t>Marks: 4 Marks | Bloom's Level: K4 - Analyse | Workspace: TASKS/Task07/</w:t>
       </w:r>
     </w:p>
     <w:p>
@@ -9415,7 +9364,7 @@
               <a:graphicData uri="http://schemas.openxmlformats.org/drawingml/2006/picture">
                 <pic:pic>
                   <pic:nvPicPr>
-                    <pic:cNvPr id="0" name="screenshot_Task-07.png"/>
+                    <pic:cNvPr id="0" name="screenshot_Task07.png"/>
                     <pic:cNvPicPr/>
                   </pic:nvPicPr>
                   <pic:blipFill>
@@ -9475,7 +9424,7 @@
     </w:p>
     <w:p>
       <w:r>
-        <w:t>Marks: 4 Marks | Bloom's Level: K4 - Analyse | Workspace: Task08/</w:t>
+        <w:t>Marks: 4 Marks | Bloom's Level: K4 - Analyse | Workspace: TASKS/Task08/</w:t>
       </w:r>
     </w:p>
     <w:p>
@@ -9901,7 +9850,7 @@
               <a:graphicData uri="http://schemas.openxmlformats.org/drawingml/2006/picture">
                 <pic:pic>
                   <pic:nvPicPr>
-                    <pic:cNvPr id="0" name="screenshot_Task-08.png"/>
+                    <pic:cNvPr id="0" name="screenshot_Task08.png"/>
                     <pic:cNvPicPr/>
                   </pic:nvPicPr>
                   <pic:blipFill>
@@ -10036,7 +9985,7 @@
     </w:p>
     <w:p>
       <w:r>
-        <w:t>Marks: 4 Marks | Bloom's Level: K4 - Analyse | Workspace: Task09/</w:t>
+        <w:t>Marks: 4 Marks | Bloom's Level: K4 - Analyse | Workspace: TASKS/Task09/</w:t>
       </w:r>
     </w:p>
     <w:p>
@@ -10328,7 +10277,7 @@
               <a:graphicData uri="http://schemas.openxmlformats.org/drawingml/2006/picture">
                 <pic:pic>
                   <pic:nvPicPr>
-                    <pic:cNvPr id="0" name="screenshot_Task-09.png"/>
+                    <pic:cNvPr id="0" name="screenshot_Task09.png"/>
                     <pic:cNvPicPr/>
                   </pic:nvPicPr>
                   <pic:blipFill>
@@ -10388,7 +10337,7 @@
     </w:p>
     <w:p>
       <w:r>
-        <w:t>Marks: 3 Marks | Bloom's Level: K4 - Analyse | Workspace: Task10/</w:t>
+        <w:t>Marks: 3 Marks | Bloom's Level: K4 - Analyse | Workspace: TASKS/Task10/</w:t>
       </w:r>
     </w:p>
     <w:p>
@@ -10668,7 +10617,7 @@
               <a:graphicData uri="http://schemas.openxmlformats.org/drawingml/2006/picture">
                 <pic:pic>
                   <pic:nvPicPr>
-                    <pic:cNvPr id="0" name="screenshot_Task-10.png"/>
+                    <pic:cNvPr id="0" name="screenshot_Task10.png"/>
                     <pic:cNvPicPr/>
                   </pic:nvPicPr>
                   <pic:blipFill>
@@ -10728,7 +10677,7 @@
     </w:p>
     <w:p>
       <w:r>
-        <w:t>Marks: 5 Marks | Bloom's Level: K5 - Evaluate | Workspace: Task11/</w:t>
+        <w:t>Marks: 5 Marks | Bloom's Level: K5 - Evaluate | Workspace: TASKS/Task11/</w:t>
       </w:r>
     </w:p>
     <w:p>
@@ -11985,9 +11934,11 @@
             <w:r>
               <w:rPr>
                 <w:rFonts w:ascii="Calibri" w:hAnsi="Calibri"/>
+                <w:b/>
+                <w:color w:val="276749"/>
                 <w:sz w:val="17"/>
               </w:rPr>
-              <w:t>100% MATCH</w:t>
+              <w:t>Exact Match</w:t>
             </w:r>
           </w:p>
         </w:tc>
@@ -12178,7 +12129,7 @@
               <a:graphicData uri="http://schemas.openxmlformats.org/drawingml/2006/picture">
                 <pic:pic>
                   <pic:nvPicPr>
-                    <pic:cNvPr id="0" name="screenshot_Task-11.png"/>
+                    <pic:cNvPr id="0" name="screenshot_Task11.png"/>
                     <pic:cNvPicPr/>
                   </pic:nvPicPr>
                   <pic:blipFill>
@@ -12260,7 +12211,7 @@
     </w:p>
     <w:p>
       <w:r>
-        <w:t>Marks: 8 Marks | Bloom's Level: K5 - Evaluate | Workspace: Task12/</w:t>
+        <w:t>Marks: 8 Marks | Bloom's Level: K5 - Evaluate | Workspace: TASKS/Task12/</w:t>
       </w:r>
     </w:p>
     <w:p>
@@ -14146,7 +14097,7 @@
               <a:graphicData uri="http://schemas.openxmlformats.org/drawingml/2006/picture">
                 <pic:pic>
                   <pic:nvPicPr>
-                    <pic:cNvPr id="0" name="screenshot_Task-12.png"/>
+                    <pic:cNvPr id="0" name="screenshot_Task12.png"/>
                     <pic:cNvPicPr/>
                   </pic:nvPicPr>
                   <pic:blipFill>

</xml_diff>

<commit_message>
feat(task12): implement genuine time-of-day delivery pricing and 24-hr pass lifecycle
</commit_message>
<xml_diff>
--- a/report/SIMATS_Java_Assignment_1_Report.docx
+++ b/report/SIMATS_Java_Assignment_1_Report.docx
@@ -12541,7 +12541,7 @@
                 <w:rFonts w:ascii="Calibri" w:hAnsi="Calibri"/>
                 <w:sz w:val="17"/>
               </w:rPr>
-              <w:t>Peak rate = Rs 60.0/hr; Off-peak = Rs 30.0/hr</w:t>
+              <w:t>Peak: Rs 60/hr (09:00–17:00); Off-peak: Rs 30/hr. Partitioned ceil((m+59)/60)</w:t>
             </w:r>
           </w:p>
         </w:tc>
@@ -12566,7 +12566,7 @@
                 <w:rFonts w:ascii="Calibri" w:hAnsi="Calibri"/>
                 <w:sz w:val="17"/>
               </w:rPr>
-              <w:t>2x Car rate (2*30=60) during business hours; 1x off-peak</w:t>
+              <w:t>2x Car rate during peak; 1x off-peak; ceiling rounding per window</w:t>
             </w:r>
           </w:p>
         </w:tc>
@@ -12643,7 +12643,7 @@
                 <w:rFonts w:ascii="Calibri" w:hAnsi="Calibri"/>
                 <w:sz w:val="17"/>
               </w:rPr>
-              <w:t>Pass price set to flat Rs 100.0 (valid 24 hrs)</w:t>
+              <w:t>Pass price flat Rs 100.0, valid 24h from issue. Valid waives fee; expired charges stay</w:t>
             </w:r>
           </w:p>
         </w:tc>
@@ -12842,15 +12842,15 @@
       <w:r>
         <w:t>Pricing is decoupled into a pluggable Strategy Pattern architecture:</w:t>
         <w:br/>
-        <w:t>• PricingStrategy (Interface): Defines calculateFee(int hours).</w:t>
+        <w:t>• PricingStrategy (Interface): Defines calculateFee(entryTime, exitTime) with default duration adapter.</w:t>
         <w:br/>
         <w:t>• HourlyPricing: Standard duration-based billing (Car @ Rs 30/hr).</w:t>
         <w:br/>
         <w:t>• FlatPricing: Fixed flat fee regardless of duration (E-Bike @ Rs 15.0).</w:t>
         <w:br/>
-        <w:t>• DeliveryPricing: Peak window billing (Rs 60/hr) and off-peak billing (Rs 30/hr).</w:t>
+        <w:t>• DeliveryPricing: Evaluates actual time overlap with 9 AM–5 PM peak window (Rs 60/hr) vs off-peak (Rs 30/hr) with partitioned ceiling rounding.</w:t>
         <w:br/>
-        <w:t>• Pass Interface &amp; OneDayPass: Manages 24-hour pass validity, waiving per-exit fees.</w:t>
+        <w:t>• Pass Interface &amp; OneDayPass: Manages 24-hour pass validity from issue timestamp, waiving exit fees during validity and charging standard stay upon expiration.</w:t>
       </w:r>
     </w:p>
     <w:p>
@@ -13168,7 +13168,7 @@
                 <w:rFonts w:ascii="Calibri" w:hAnsi="Calibri"/>
                 <w:sz w:val="17"/>
               </w:rPr>
-              <w:t>E-Bike 2 hrs (TN06F6)</w:t>
+              <w:t>E-Bike Flat Rate (8:00–14:00)</w:t>
             </w:r>
           </w:p>
         </w:tc>
@@ -13218,7 +13218,7 @@
                 <w:rFonts w:ascii="Calibri" w:hAnsi="Calibri"/>
                 <w:sz w:val="17"/>
               </w:rPr>
-              <w:t>Identical flat fee Rs 15.0</w:t>
+              <w:t>Fixed flat fee Rs 15.0</w:t>
             </w:r>
           </w:p>
         </w:tc>
@@ -13322,7 +13322,7 @@
                 <w:rFonts w:ascii="Calibri" w:hAnsi="Calibri"/>
                 <w:sz w:val="17"/>
               </w:rPr>
-              <w:t>Delivery Van Peak 2 hrs (TN07G7)</w:t>
+              <w:t>Van Peak Only (10:00–12:00)</w:t>
             </w:r>
           </w:p>
         </w:tc>
@@ -13476,7 +13476,7 @@
                 <w:rFonts w:ascii="Calibri" w:hAnsi="Calibri"/>
                 <w:sz w:val="17"/>
               </w:rPr>
-              <w:t>Delivery Van Off-Peak 2 hrs (TN07G7)</w:t>
+              <w:t>Van Off-Peak (06:00–08:00)</w:t>
             </w:r>
           </w:p>
         </w:tc>
@@ -13630,7 +13630,7 @@
                 <w:rFonts w:ascii="Calibri" w:hAnsi="Calibri"/>
                 <w:sz w:val="17"/>
               </w:rPr>
-              <w:t>Visitor 24-Hr One-Day Pass</w:t>
+              <w:t>Van Boundary (08:00–10:00)</w:t>
             </w:r>
           </w:p>
         </w:tc>
@@ -13655,7 +13655,7 @@
                 <w:rFonts w:ascii="Calibri" w:hAnsi="Calibri"/>
                 <w:sz w:val="17"/>
               </w:rPr>
-              <w:t>OneDayPass (Price Rs 100.0)</w:t>
+              <w:t>DeliveryPricing (1h off + 1h pk)</w:t>
             </w:r>
           </w:p>
         </w:tc>
@@ -13680,7 +13680,7 @@
                 <w:rFonts w:ascii="Calibri" w:hAnsi="Calibri"/>
                 <w:sz w:val="17"/>
               </w:rPr>
-              <w:t>Valid 24 hrs (true), Exit waived: Rs 0.0</w:t>
+              <w:t>1*30 + 1*60 = Rs 90.0</w:t>
             </w:r>
           </w:p>
         </w:tc>
@@ -13705,7 +13705,7 @@
                 <w:rFonts w:ascii="Calibri" w:hAnsi="Calibri"/>
                 <w:sz w:val="17"/>
               </w:rPr>
-              <w:t>Valid: true, Exit: Rs 0.0</w:t>
+              <w:t>Rs 90.0</w:t>
             </w:r>
           </w:p>
         </w:tc>
@@ -13784,7 +13784,7 @@
                 <w:rFonts w:ascii="Calibri" w:hAnsi="Calibri"/>
                 <w:sz w:val="17"/>
               </w:rPr>
-              <w:t>5-Floor Jagged Allocation</w:t>
+              <w:t>Visitor Pass (5h, Valid)</w:t>
             </w:r>
           </w:p>
         </w:tc>
@@ -13809,7 +13809,315 @@
                 <w:rFonts w:ascii="Calibri" w:hAnsi="Calibri"/>
                 <w:sz w:val="17"/>
               </w:rPr>
-              <w:t>Capacities [30, 25, 20, 15, 10]</w:t>
+              <w:t>OneDayPass (Price Rs 100.0)</w:t>
+            </w:r>
+          </w:p>
+        </w:tc>
+        <w:tc>
+          <w:tcPr>
+            <w:tcW w:type="dxa" w:w="2016"/>
+            <w:shd w:fill="FFFFFF"/>
+            <w:tcMar>
+              <w:top w:w="80" w:type="dxa"/>
+              <w:bottom w:w="80" w:type="dxa"/>
+              <w:left w:w="120" w:type="dxa"/>
+              <w:right w:w="120" w:type="dxa"/>
+            </w:tcMar>
+            <w:vAlign w:val="center"/>
+          </w:tcPr>
+          <w:p>
+            <w:pPr>
+              <w:spacing w:after="0"/>
+            </w:pPr>
+            <w:r>
+              <w:rPr>
+                <w:rFonts w:ascii="Calibri" w:hAnsi="Calibri"/>
+                <w:sz w:val="17"/>
+              </w:rPr>
+              <w:t>Valid: true, Exit waived: Rs 0.0</w:t>
+            </w:r>
+          </w:p>
+        </w:tc>
+        <w:tc>
+          <w:tcPr>
+            <w:tcW w:type="dxa" w:w="1728"/>
+            <w:shd w:fill="FFFFFF"/>
+            <w:tcMar>
+              <w:top w:w="80" w:type="dxa"/>
+              <w:bottom w:w="80" w:type="dxa"/>
+              <w:left w:w="120" w:type="dxa"/>
+              <w:right w:w="120" w:type="dxa"/>
+            </w:tcMar>
+            <w:vAlign w:val="center"/>
+          </w:tcPr>
+          <w:p>
+            <w:pPr>
+              <w:spacing w:after="0"/>
+            </w:pPr>
+            <w:r>
+              <w:rPr>
+                <w:rFonts w:ascii="Calibri" w:hAnsi="Calibri"/>
+                <w:sz w:val="17"/>
+              </w:rPr>
+              <w:t>Valid: true, Exit: Rs 0.0</w:t>
+            </w:r>
+          </w:p>
+        </w:tc>
+        <w:tc>
+          <w:tcPr>
+            <w:tcW w:type="dxa" w:w="1008"/>
+            <w:shd w:fill="FFFFFF"/>
+            <w:tcMar>
+              <w:top w:w="80" w:type="dxa"/>
+              <w:bottom w:w="80" w:type="dxa"/>
+              <w:left w:w="120" w:type="dxa"/>
+              <w:right w:w="120" w:type="dxa"/>
+            </w:tcMar>
+            <w:vAlign w:val="center"/>
+          </w:tcPr>
+          <w:p>
+            <w:pPr>
+              <w:spacing w:after="0"/>
+            </w:pPr>
+            <w:r>
+              <w:rPr>
+                <w:rFonts w:ascii="Calibri" w:hAnsi="Calibri"/>
+                <w:b/>
+                <w:color w:val="276749"/>
+                <w:sz w:val="17"/>
+              </w:rPr>
+              <w:t>Pass</w:t>
+            </w:r>
+          </w:p>
+        </w:tc>
+      </w:tr>
+      <w:tr>
+        <w:tc>
+          <w:tcPr>
+            <w:tcW w:type="dxa" w:w="1152"/>
+            <w:shd w:fill="F7FAFC"/>
+            <w:tcMar>
+              <w:top w:w="80" w:type="dxa"/>
+              <w:bottom w:w="80" w:type="dxa"/>
+              <w:left w:w="120" w:type="dxa"/>
+              <w:right w:w="120" w:type="dxa"/>
+            </w:tcMar>
+            <w:vAlign w:val="center"/>
+          </w:tcPr>
+          <w:p>
+            <w:pPr>
+              <w:spacing w:after="0"/>
+            </w:pPr>
+            <w:r>
+              <w:rPr>
+                <w:rFonts w:ascii="Calibri" w:hAnsi="Calibri"/>
+                <w:sz w:val="17"/>
+              </w:rPr>
+              <w:t>TC_12_06</w:t>
+            </w:r>
+          </w:p>
+        </w:tc>
+        <w:tc>
+          <w:tcPr>
+            <w:tcW w:type="dxa" w:w="2592"/>
+            <w:shd w:fill="F7FAFC"/>
+            <w:tcMar>
+              <w:top w:w="80" w:type="dxa"/>
+              <w:bottom w:w="80" w:type="dxa"/>
+              <w:left w:w="120" w:type="dxa"/>
+              <w:right w:w="120" w:type="dxa"/>
+            </w:tcMar>
+            <w:vAlign w:val="center"/>
+          </w:tcPr>
+          <w:p>
+            <w:pPr>
+              <w:spacing w:after="0"/>
+            </w:pPr>
+            <w:r>
+              <w:rPr>
+                <w:rFonts w:ascii="Calibri" w:hAnsi="Calibri"/>
+                <w:sz w:val="17"/>
+              </w:rPr>
+              <w:t>Visitor Pass (26h, Expired)</w:t>
+            </w:r>
+          </w:p>
+        </w:tc>
+        <w:tc>
+          <w:tcPr>
+            <w:tcW w:type="dxa" w:w="2304"/>
+            <w:shd w:fill="F7FAFC"/>
+            <w:tcMar>
+              <w:top w:w="80" w:type="dxa"/>
+              <w:bottom w:w="80" w:type="dxa"/>
+              <w:left w:w="120" w:type="dxa"/>
+              <w:right w:w="120" w:type="dxa"/>
+            </w:tcMar>
+            <w:vAlign w:val="center"/>
+          </w:tcPr>
+          <w:p>
+            <w:pPr>
+              <w:spacing w:after="0"/>
+            </w:pPr>
+            <w:r>
+              <w:rPr>
+                <w:rFonts w:ascii="Calibri" w:hAnsi="Calibri"/>
+                <w:sz w:val="17"/>
+              </w:rPr>
+              <w:t>OneDayPass (Expired)</w:t>
+            </w:r>
+          </w:p>
+        </w:tc>
+        <w:tc>
+          <w:tcPr>
+            <w:tcW w:type="dxa" w:w="2016"/>
+            <w:shd w:fill="F7FAFC"/>
+            <w:tcMar>
+              <w:top w:w="80" w:type="dxa"/>
+              <w:bottom w:w="80" w:type="dxa"/>
+              <w:left w:w="120" w:type="dxa"/>
+              <w:right w:w="120" w:type="dxa"/>
+            </w:tcMar>
+            <w:vAlign w:val="center"/>
+          </w:tcPr>
+          <w:p>
+            <w:pPr>
+              <w:spacing w:after="0"/>
+            </w:pPr>
+            <w:r>
+              <w:rPr>
+                <w:rFonts w:ascii="Calibri" w:hAnsi="Calibri"/>
+                <w:sz w:val="17"/>
+              </w:rPr>
+              <w:t>Valid: false, Charge 2h: Rs 60.0</w:t>
+            </w:r>
+          </w:p>
+        </w:tc>
+        <w:tc>
+          <w:tcPr>
+            <w:tcW w:type="dxa" w:w="1728"/>
+            <w:shd w:fill="F7FAFC"/>
+            <w:tcMar>
+              <w:top w:w="80" w:type="dxa"/>
+              <w:bottom w:w="80" w:type="dxa"/>
+              <w:left w:w="120" w:type="dxa"/>
+              <w:right w:w="120" w:type="dxa"/>
+            </w:tcMar>
+            <w:vAlign w:val="center"/>
+          </w:tcPr>
+          <w:p>
+            <w:pPr>
+              <w:spacing w:after="0"/>
+            </w:pPr>
+            <w:r>
+              <w:rPr>
+                <w:rFonts w:ascii="Calibri" w:hAnsi="Calibri"/>
+                <w:sz w:val="17"/>
+              </w:rPr>
+              <w:t>Valid: false, Fee: Rs 60.0</w:t>
+            </w:r>
+          </w:p>
+        </w:tc>
+        <w:tc>
+          <w:tcPr>
+            <w:tcW w:type="dxa" w:w="1008"/>
+            <w:shd w:fill="F7FAFC"/>
+            <w:tcMar>
+              <w:top w:w="80" w:type="dxa"/>
+              <w:bottom w:w="80" w:type="dxa"/>
+              <w:left w:w="120" w:type="dxa"/>
+              <w:right w:w="120" w:type="dxa"/>
+            </w:tcMar>
+            <w:vAlign w:val="center"/>
+          </w:tcPr>
+          <w:p>
+            <w:pPr>
+              <w:spacing w:after="0"/>
+            </w:pPr>
+            <w:r>
+              <w:rPr>
+                <w:rFonts w:ascii="Calibri" w:hAnsi="Calibri"/>
+                <w:b/>
+                <w:color w:val="276749"/>
+                <w:sz w:val="17"/>
+              </w:rPr>
+              <w:t>Pass</w:t>
+            </w:r>
+          </w:p>
+        </w:tc>
+      </w:tr>
+      <w:tr>
+        <w:tc>
+          <w:tcPr>
+            <w:tcW w:type="dxa" w:w="1152"/>
+            <w:shd w:fill="FFFFFF"/>
+            <w:tcMar>
+              <w:top w:w="80" w:type="dxa"/>
+              <w:bottom w:w="80" w:type="dxa"/>
+              <w:left w:w="120" w:type="dxa"/>
+              <w:right w:w="120" w:type="dxa"/>
+            </w:tcMar>
+            <w:vAlign w:val="center"/>
+          </w:tcPr>
+          <w:p>
+            <w:pPr>
+              <w:spacing w:after="0"/>
+            </w:pPr>
+            <w:r>
+              <w:rPr>
+                <w:rFonts w:ascii="Calibri" w:hAnsi="Calibri"/>
+                <w:sz w:val="17"/>
+              </w:rPr>
+              <w:t>TC_12_07</w:t>
+            </w:r>
+          </w:p>
+        </w:tc>
+        <w:tc>
+          <w:tcPr>
+            <w:tcW w:type="dxa" w:w="2592"/>
+            <w:shd w:fill="FFFFFF"/>
+            <w:tcMar>
+              <w:top w:w="80" w:type="dxa"/>
+              <w:bottom w:w="80" w:type="dxa"/>
+              <w:left w:w="120" w:type="dxa"/>
+              <w:right w:w="120" w:type="dxa"/>
+            </w:tcMar>
+            <w:vAlign w:val="center"/>
+          </w:tcPr>
+          <w:p>
+            <w:pPr>
+              <w:spacing w:after="0"/>
+            </w:pPr>
+            <w:r>
+              <w:rPr>
+                <w:rFonts w:ascii="Calibri" w:hAnsi="Calibri"/>
+                <w:sz w:val="17"/>
+              </w:rPr>
+              <w:t>5-Floor Jagged Capacity</w:t>
+            </w:r>
+          </w:p>
+        </w:tc>
+        <w:tc>
+          <w:tcPr>
+            <w:tcW w:type="dxa" w:w="2304"/>
+            <w:shd w:fill="FFFFFF"/>
+            <w:tcMar>
+              <w:top w:w="80" w:type="dxa"/>
+              <w:bottom w:w="80" w:type="dxa"/>
+              <w:left w:w="120" w:type="dxa"/>
+              <w:right w:w="120" w:type="dxa"/>
+            </w:tcMar>
+            <w:vAlign w:val="center"/>
+          </w:tcPr>
+          <w:p>
+            <w:pPr>
+              <w:spacing w:after="0"/>
+            </w:pPr>
+            <w:r>
+              <w:rPr>
+                <w:rFonts w:ascii="Calibri" w:hAnsi="Calibri"/>
+                <w:sz w:val="17"/>
+              </w:rPr>
+              <w:t>AdaptedParkingFacility</w:t>
             </w:r>
           </w:p>
         </w:tc>
@@ -13984,7 +14292,7 @@
                 <w:color w:val="E2E8F0"/>
                 <w:sz w:val="16"/>
               </w:rPr>
-              <w:t>E-bike fee: Rs 15.0</w:t>
+              <w:t>E-bike fee (flat rate): Rs 15.0</w:t>
               <w:br/>
               <w:br/>
             </w:r>
@@ -13994,7 +14302,7 @@
                 <w:color w:val="E2E8F0"/>
                 <w:sz w:val="16"/>
               </w:rPr>
-              <w:t>Van peak fee (2 hours): Rs 120.0</w:t>
+              <w:t>Van peak fee (10:00 to 12:00, 2h peak @ Rs 60): Rs 120.0</w:t>
               <w:br/>
               <w:br/>
             </w:r>
@@ -14004,7 +14312,7 @@
                 <w:color w:val="E2E8F0"/>
                 <w:sz w:val="16"/>
               </w:rPr>
-              <w:t>Van off-peak fee (2 hours): Rs 60.0</w:t>
+              <w:t>Van off-peak fee (06:00 to 08:00, 2h off-peak @ Rs 30): Rs 60.0</w:t>
               <w:br/>
               <w:br/>
             </w:r>
@@ -14014,6 +14322,16 @@
                 <w:color w:val="E2E8F0"/>
                 <w:sz w:val="16"/>
               </w:rPr>
+              <w:t>Van boundary fee (08:00 to 10:00, 1h off-peak + 1h peak): Rs 90.0</w:t>
+              <w:br/>
+              <w:br/>
+            </w:r>
+            <w:r>
+              <w:rPr>
+                <w:rFonts w:ascii="Consolas" w:hAnsi="Consolas"/>
+                <w:color w:val="E2E8F0"/>
+                <w:sz w:val="16"/>
+              </w:rPr>
               <w:t>Pass price: Rs 100.0</w:t>
               <w:br/>
               <w:br/>
@@ -14024,7 +14342,7 @@
                 <w:color w:val="E2E8F0"/>
                 <w:sz w:val="16"/>
               </w:rPr>
-              <w:t>Pass valid for 24 hours: true</w:t>
+              <w:t>Pass valid at Day 1 14:00 (5h after issue): true</w:t>
               <w:br/>
               <w:br/>
             </w:r>
@@ -14035,6 +14353,26 @@
                 <w:sz w:val="16"/>
               </w:rPr>
               <w:t>Pass waives exit fee: Rs 0.0</w:t>
+              <w:br/>
+              <w:br/>
+            </w:r>
+            <w:r>
+              <w:rPr>
+                <w:rFonts w:ascii="Consolas" w:hAnsi="Consolas"/>
+                <w:color w:val="E2E8F0"/>
+                <w:sz w:val="16"/>
+              </w:rPr>
+              <w:t>Pass valid at Day 2 11:00 (26h after issue): false</w:t>
+              <w:br/>
+              <w:br/>
+            </w:r>
+            <w:r>
+              <w:rPr>
+                <w:rFonts w:ascii="Consolas" w:hAnsi="Consolas"/>
+                <w:color w:val="E2E8F0"/>
+                <w:sz w:val="16"/>
+              </w:rPr>
+              <w:t>Fee with expired pass (2h stay @ Rs 30): Rs 60.0</w:t>
               <w:br/>
               <w:br/>
             </w:r>

</xml_diff>